<commit_message>
P7 7b: album-level AcoustID clustering (Fingerprinter)
</commit_message>
<xml_diff>
--- a/user_guides/individual_programs/audio_fingerprinter/Audio_Fingerprinter_User_Guide.docx
+++ b/user_guides/individual_programs/audio_fingerprinter/Audio_Fingerprinter_User_Guide.docx
@@ -223,6 +223,20 @@
         <w:rPr>
           <w:b/>
         </w:rPr>
+        <w:t xml:space="preserve">Album Match: </w:t>
+      </w:r>
+      <w:r>
+        <w:t>Clusters each folder's lookups by MusicBrainz release group and tags only when the album is decided. A release group forms a cluster when at least three files (the --album-min default) carry candidates in it; the cluster is decided when its score (files voting times average confidence) leads the runner-up by 25 percent. Ambiguous albums are left untagged with the runner-up surfaced. Files no decided cluster claims fall back to per-file matching. Disabled by default.</w:t>
+      </w:r>
+    </w:p>
+    <w:p>
+      <w:pPr>
+        <w:pStyle w:val="ListBullet"/>
+      </w:pPr>
+      <w:r>
+        <w:rPr>
+          <w:b/>
+        </w:rPr>
         <w:t xml:space="preserve">Min Score: </w:t>
       </w:r>
       <w:r>
@@ -273,6 +287,11 @@
     <w:p>
       <w:r>
         <w:t>The GUI writes fingerprint_dry_run_log.txt or fingerprint_live_log.txt in the input directory. Results are sorted by file path when displayed.</w:t>
+      </w:r>
+    </w:p>
+    <w:p>
+      <w:r>
+        <w:t>In Album Match mode the log starts with one [ALBUM] line per folder summarising the cluster decision, files decided by an album carry an 'album consensus' note in their message, and the summary adds an Album Ambiguous count when any folder tied.</w:t>
       </w:r>
     </w:p>
     <w:p>
@@ -337,6 +356,11 @@
       </w:pPr>
       <w:r>
         <w:t>Optionally write Acoustid Fingerprint and Acoustid Id in Live Update mode.</w:t>
+      </w:r>
+    </w:p>
+    <w:p>
+      <w:r>
+        <w:t>Album Match mode runs the same pipeline in two phases: every file is fingerprinted first (the live log shows ANALYSED lines), then all lookups run through the rate-limited batch client, each folder is clustered by MusicBrainz release group, and only decided albums are tagged.</w:t>
       </w:r>
     </w:p>
     <w:p>
@@ -419,6 +443,20 @@
     </w:p>
     <w:p>
       <w:pPr>
+        <w:pStyle w:val="ListBullet"/>
+      </w:pPr>
+      <w:r>
+        <w:rPr>
+          <w:b/>
+        </w:rPr>
+        <w:t xml:space="preserve">Album clustering: </w:t>
+      </w:r>
+      <w:r>
+        <w:t>In Album Match mode each folder's candidates are grouped by MusicBrainz release group. A group with at least the album-minimum of voting files forms a cluster scored as (files voting) times (average confidence). A cluster is decided only when it leads the runner-up by 25 percent; otherwise the album is reported ambiguous and its files are left untagged with both clusters named. A decided cluster pulls each voting file to its best candidate inside the winning release group, which resolves remix-versus-original near ties that per-file scores cannot. Files outside the decided cluster keep the per-file matching described above, including the tag-aware near-tie break.</w:t>
+      </w:r>
+    </w:p>
+    <w:p>
+      <w:pPr>
         <w:pStyle w:val="Heading1"/>
       </w:pPr>
       <w:r>
@@ -456,12 +494,14 @@
         <w:br/>
         <w:t>python -m audio_suite_shared.cli_app fingerprint &lt;folder&gt; --write-tags --live --api-key &lt;key&gt;</w:t>
         <w:br/>
+        <w:t>python -m audio_suite_shared.cli_app fingerprint &lt;folder&gt; --album-mode --album-min 3 --write-tags --live</w:t>
+        <w:br/>
         <w:t>python -m audio_suite_shared.cli_app fingerprint &lt;folder&gt; --fpcalc &lt;path&gt; --json</w:t>
       </w:r>
     </w:p>
     <w:p>
       <w:r>
-        <w:t>Options include --lookup/--no-lookup, --write-tags/--no-write-tags, --threshold, --max-length, --fpcalc, --api-key, --dry, and --json. Lookup requires an API key. Text output reports files, identified matches, tagged files, errors, and elapsed time.</w:t>
+        <w:t>Options include --lookup/--no-lookup, --write-tags/--no-write-tags, --threshold, --max-length, --fpcalc, --api-key, --album-mode/--no-album-mode (cluster each folder by release group; tag only decided albums), --album-min (minimum voting files per release group, default 3, at least 1), --dry, and --json. Lookup requires an API key. Text output reports files, identified matches, tagged files, errors, and elapsed time.</w:t>
       </w:r>
     </w:p>
     <w:p>
@@ -553,6 +593,20 @@
       </w:r>
       <w:r>
         <w:t>Confirm Live Update and Write AcoustID tags are enabled, and that files are writable. Dry Run never writes tags.</w:t>
+      </w:r>
+    </w:p>
+    <w:p>
+      <w:pPr>
+        <w:pStyle w:val="ListBullet"/>
+      </w:pPr>
+      <w:r>
+        <w:rPr>
+          <w:b/>
+        </w:rPr>
+        <w:t xml:space="preserve">Album files left untagged (ALBUM AMBIGUOUS): </w:t>
+      </w:r>
+      <w:r>
+        <w:t>The folder's release-group clusters tied inside the decision margin, so album mode refuses to guess; the log names both clusters. Lower --album-min or resolve the ambiguity manually; a run without Album Match still applies per-file matching.</w:t>
       </w:r>
     </w:p>
     <w:p>

</xml_diff>

<commit_message>
E2: write MusicBrainz identifiers from the fingerprinter; fix inverted release-group path
</commit_message>
<xml_diff>
--- a/user_guides/individual_programs/audio_fingerprinter/Audio_Fingerprinter_User_Guide.docx
+++ b/user_guides/individual_programs/audio_fingerprinter/Audio_Fingerprinter_User_Guide.docx
@@ -213,6 +213,34 @@
       </w:r>
       <w:r>
         <w:t>Writes match metadata only for a match in Live Update mode; disabled by default.</w:t>
+      </w:r>
+    </w:p>
+    <w:p>
+      <w:pPr>
+        <w:pStyle w:val="ListBullet"/>
+      </w:pPr>
+      <w:r>
+        <w:rPr>
+          <w:b/>
+        </w:rPr>
+        <w:t xml:space="preserve">Write MusicBrainz identifiers: </w:t>
+      </w:r>
+      <w:r>
+        <w:t>Adds MUSICBRAINZ_TRACKID, MUSICBRAINZ_ARTISTID and (when one release is unambiguous) MUSICBRAINZ_ALBUMID to the AcoustID tags. Needs the option above and Live Update; disabled by default. The album id is never guessed - a recording is typically released many times, and the id is written only when exactly one release survives the selection criteria below.</w:t>
+      </w:r>
+    </w:p>
+    <w:p>
+      <w:pPr>
+        <w:pStyle w:val="ListBullet"/>
+      </w:pPr>
+      <w:r>
+        <w:rPr>
+          <w:b/>
+        </w:rPr>
+        <w:t xml:space="preserve">MBID Region: </w:t>
+      </w:r>
+      <w:r>
+        <w:t>Optional two-letter country code (ISO 3166-1 alpha-2, e.g. GB) stored in suite configuration. It only breaks ties between otherwise identical releases (same track and disc counts, same release group); it can never select a release on its own.</w:t>
       </w:r>
     </w:p>
     <w:p>
@@ -470,6 +498,16 @@
     </w:p>
     <w:p>
       <w:r>
+        <w:t>When Write MusicBrainz identifiers is also enabled, the run writes the matched recording as MUSICBRAINZ_TRACKID, the credited artist as MUSICBRAINZ_ARTISTID, and - only when exactly one release survives - the release as MUSICBRAINZ_ALBUMID. The identifiers are stored in each format's native convention: TXXX frames for MP3/WAV/AIFF, Vorbis comments for FLAC/OGG/Opus, and iTunes freeform atoms for M4A/MP4.</w:t>
+      </w:r>
+    </w:p>
+    <w:p>
+      <w:r>
+        <w:t>The album id uses the releases already reported by AcoustID - no separate MusicBrainz lookup is made. Candidates are narrowed in order by an existing MUSICBRAINZ_ALBUMID on the file, the album title, the folder's track count and disc count (Album Match folders provide these), the release-group type, and finally the MBID Region preference. A criterion that would eliminate every candidate is ignored, and if more than one release still survives the field is simply not written. In per-file runs the track and disc counts are usually unknown, so the album id resolves less often than the track and artist ids.</w:t>
+      </w:r>
+    </w:p>
+    <w:p>
+      <w:r>
         <w:t>The effective API key is resolved from ACOUSTID_API_KEY first, then the encrypted acoustid_api_key value in shared suite configuration. A CLI --api-key value is used for that run. Do not place keys in scripts or logs.</w:t>
       </w:r>
     </w:p>
@@ -496,12 +534,14 @@
         <w:br/>
         <w:t>python -m audio_suite_shared.cli_app fingerprint &lt;folder&gt; --album-mode --album-min 3 --write-tags --live</w:t>
         <w:br/>
+        <w:t>python -m audio_suite_shared.cli_app fingerprint &lt;folder&gt; --write-tags --write-mbids --mbid-region GB --live</w:t>
+        <w:br/>
         <w:t>python -m audio_suite_shared.cli_app fingerprint &lt;folder&gt; --fpcalc &lt;path&gt; --json</w:t>
       </w:r>
     </w:p>
     <w:p>
       <w:r>
-        <w:t>Options include --lookup/--no-lookup, --write-tags/--no-write-tags, --threshold, --max-length, --fpcalc, --api-key, --album-mode/--no-album-mode (cluster each folder by release group; tag only decided albums), --album-min (minimum voting files per release group, default 3, at least 1), --dry, and --json. Lookup requires an API key. Text output reports files, identified matches, tagged files, errors, and elapsed time.</w:t>
+        <w:t>Options include --lookup/--no-lookup, --write-tags/--no-write-tags, --write-mbids/--no-write-mbids (needs --write-tags), --mbid-region (two-letter release country tie-break), --threshold, --max-length, --fpcalc, --api-key, --album-mode/--no-album-mode (cluster each folder by release group; tag only decided albums), --album-min (minimum voting files per release group, default 3, at least 1), --dry, and --json. Lookup requires an API key. Text output reports files, identified matches, tagged files, errors, and elapsed time.</w:t>
       </w:r>
     </w:p>
     <w:p>
@@ -593,6 +633,20 @@
       </w:r>
       <w:r>
         <w:t>Confirm Live Update and Write AcoustID tags are enabled, and that files are writable. Dry Run never writes tags.</w:t>
+      </w:r>
+    </w:p>
+    <w:p>
+      <w:pPr>
+        <w:pStyle w:val="ListBullet"/>
+      </w:pPr>
+      <w:r>
+        <w:rPr>
+          <w:b/>
+        </w:rPr>
+        <w:t xml:space="preserve">MusicBrainz album id missing: </w:t>
+      </w:r>
+      <w:r>
+        <w:t>The matched recording spans several indistinguishable releases, so the run omits MUSICBRAINZ_ALBUMID rather than guess. Set an MBID Region, use Album Match so the folder's track and disc counts can narrow the candidates, or accept that only the track and artist ids were written.</w:t>
       </w:r>
     </w:p>
     <w:p>

</xml_diff>

<commit_message>
E2-fix1: album-tag tie-break for tied clusters; surface the whole tied set
</commit_message>
<xml_diff>
--- a/user_guides/individual_programs/audio_fingerprinter/Audio_Fingerprinter_User_Guide.docx
+++ b/user_guides/individual_programs/audio_fingerprinter/Audio_Fingerprinter_User_Guide.docx
@@ -254,7 +254,7 @@
         <w:t xml:space="preserve">Album Match: </w:t>
       </w:r>
       <w:r>
-        <w:t>Clusters each folder's lookups by MusicBrainz release group and tags only when the album is decided. A release group forms a cluster when at least three files (the --album-min default) carry candidates in it; the cluster is decided when its score (files voting times average confidence) leads the runner-up by 25 percent. Ambiguous albums are left untagged with the runner-up surfaced. Files no decided cluster claims fall back to per-file matching. Disabled by default.</w:t>
+        <w:t>Clusters each folder's lookups by MusicBrainz release group and tags only when the album is decided. A release group forms a cluster when at least three files (the --album-min default) carry candidates in it; the cluster is decided when its score (files voting times average confidence) leads the runner-up by 25 percent. Well-known albums often tie exactly (one test album produced eight clusters at the same score, because a recording appears on every release group containing it); when the files share one album tag and it matches exactly one tied cluster, that cluster is decided - the user's own tag is the evidence, and a match against several clusters still refuses to guess. Ambiguous albums are left untagged with the whole tied set named in the log. Files no decided cluster claims fall back to per-file matching. Disabled by default.</w:t>
       </w:r>
     </w:p>
     <w:p>
@@ -660,7 +660,7 @@
         <w:t xml:space="preserve">Album files left untagged (ALBUM AMBIGUOUS): </w:t>
       </w:r>
       <w:r>
-        <w:t>The folder's release-group clusters tied inside the decision margin, so album mode refuses to guess; the log names both clusters. Lower --album-min or resolve the ambiguity manually; a run without Album Match still applies per-file matching.</w:t>
+        <w:t>The folder's release-group clusters tied inside the decision margin, so album mode refuses to guess; the log names every tied cluster and its scores, and the files' shared album tag already decides the tie when it matches exactly one of them. Otherwise lower --album-min, fix the album tag, or resolve the ambiguity manually; a run without Album Match still applies per-file matching.</w:t>
       </w:r>
     </w:p>
     <w:p>

</xml_diff>